<commit_message>
feat: ajout routes Joueur et Notification, correction CDC MySQL, évolutions futures
</commit_message>
<xml_diff>
--- a/Docs/Cahier des charges ArenaKick.docx
+++ b/Docs/Cahier des charges ArenaKick.docx
@@ -6639,13 +6639,17 @@
             </w:tcMar>
           </w:tcPr>
           <w:p>
-            <w:r>
-              <w:rPr>
-                <w:color w:val="2E75B6"/>
-                <w:sz w:val="20"/>
-                <w:szCs w:val="20"/>
-              </w:rPr>
-              <w:t>SQLite</w:t>
+            <w:pPr>
+              <w:rPr>
+                <w:lang w:val="fr-FR"/>
+              </w:rPr>
+            </w:pPr>
+            <w:r>
+              <w:rPr>
+                <w:color w:val="4472C4" w:themeColor="accent1"/>
+                <w:lang w:val="fr-FR"/>
+              </w:rPr>
+              <w:t>MySQL</w:t>
             </w:r>
           </w:p>
         </w:tc>
@@ -6669,11 +6673,10 @@
           <w:p>
             <w:r>
               <w:rPr>
-                <w:color w:val="000000"/>
-                <w:sz w:val="20"/>
-                <w:szCs w:val="20"/>
-              </w:rPr>
-              <w:t>Légère, sans configuration serveur, adaptée au contexte</w:t>
+                <w:sz w:val="20"/>
+                <w:szCs w:val="20"/>
+              </w:rPr>
+              <w:t>Robuste, interface phpMyAdmin, adapté au contexte académique</w:t>
             </w:r>
           </w:p>
         </w:tc>

</xml_diff>

<commit_message>
refactor: implémentation héritage classes Utilisateur ( polymorphisme SQLAlchemy )
</commit_message>
<xml_diff>
--- a/Docs/Cahier des charges ArenaKick.docx
+++ b/Docs/Cahier des charges ArenaKick.docx
@@ -6767,7 +6767,24 @@
                 <w:sz w:val="20"/>
                 <w:szCs w:val="20"/>
               </w:rPr>
-              <w:t>ORM Python facilitant les interactions avec SQLite sans écrire de SQL brut</w:t>
+              <w:t xml:space="preserve">ORM Python facilitant les interactions avec </w:t>
+            </w:r>
+            <w:r>
+              <w:rPr>
+                <w:color w:val="000000"/>
+                <w:sz w:val="20"/>
+                <w:szCs w:val="20"/>
+                <w:lang w:val="fr-FR"/>
+              </w:rPr>
+              <w:t>MySQL</w:t>
+            </w:r>
+            <w:r>
+              <w:rPr>
+                <w:color w:val="000000"/>
+                <w:sz w:val="20"/>
+                <w:szCs w:val="20"/>
+              </w:rPr>
+              <w:t xml:space="preserve"> sans écrire de SQL brut</w:t>
             </w:r>
           </w:p>
         </w:tc>
@@ -7067,6 +7084,17 @@
             </w:tcMar>
           </w:tcPr>
           <w:p>
+            <w:r>
+              <w:rPr>
+                <w:b/>
+                <w:bCs/>
+                <w:color w:val="1F3864"/>
+                <w:sz w:val="20"/>
+                <w:szCs w:val="20"/>
+                <w:lang w:val="fr-FR"/>
+              </w:rPr>
+              <w:t xml:space="preserve"> </w:t>
+            </w:r>
             <w:r>
               <w:rPr>
                 <w:b/>

</xml_diff>